<commit_message>
Update the advisor and place the official declaration form in the project book.
</commit_message>
<xml_diff>
--- a/docs/project-book.docx
+++ b/docs/project-book.docx
@@ -204,7 +204,7 @@
           <w:rtl w:val="1"/>
           <w:lang w:val="en-US" w:bidi="he-IL"/>
         </w:rPr>
-        <w:t>מור ברגיג</w:t>
+        <w:t>אסף עמיר</w:t>
       </w:r>
     </w:p>
     <w:p>
@@ -223,7 +223,7 @@
           <w:rtl w:val="1"/>
           <w:lang w:val="en-US" w:bidi="he-IL"/>
         </w:rPr>
-        <w:t>052-8612379</w:t>
+        <w:t>052-2586973</w:t>
       </w:r>
     </w:p>
     <w:p>
@@ -242,7 +242,7 @@
           <w:rtl w:val="1"/>
           <w:lang w:val="en-US" w:bidi="he-IL"/>
         </w:rPr>
-        <w:t>דרך הטייסים 28, תל אביב</w:t>
+        <w:t>שדרות קוגל 21, חולון</w:t>
       </w:r>
     </w:p>
     <w:p>
@@ -1349,45 +1349,84 @@
     </w:p>
     <w:p>
       <w:pPr>
-        <w:spacing w:line="360" w:lineRule="auto" w:after="160" w:before="0"/>
-        <w:jc w:val="both"/>
-        <w:bidi w:val="1"/>
+        <w:spacing w:before="160" w:after="40" w:line="240" w:lineRule="auto"/>
+        <w:jc w:val="center"/>
+        <w:bidi w:val="0"/>
       </w:pPr>
       <w:r>
-        <w:rPr>
-          <w:rFonts w:ascii="Arial" w:hAnsi="Arial" w:cs="Arial" w:eastAsia="Arial"/>
-          <w:b w:val="0"/>
-          <w:color w:val="1F2933"/>
-          <w:sz w:val="24"/>
-          <w:szCs w:val="24"/>
-          <w:rtl w:val="1"/>
-          <w:lang w:val="en-US" w:bidi="he-IL"/>
-        </w:rPr>
-        <w:t xml:space="preserve">אני מצהירה כי העבודה המוגשת להלן נעשתה על ידי באופן עצמאי, על פי ידיעתי האישית, תוך שימוש בקוד, במאמרים ובמקורות אחרים על פי כללי האתיקה האקדמית ובציון מקורות מתאימים. הספר מתאר את </w:t>
-      </w:r>
-      <w:r>
-        <w:rPr>
-          <w:rFonts w:ascii="Times New Roman" w:hAnsi="Times New Roman" w:cs="Times New Roman" w:eastAsia="Times New Roman"/>
-          <w:b w:val="0"/>
-          <w:color w:val="1F2933"/>
-          <w:sz w:val="24"/>
-          <w:szCs w:val="24"/>
-          <w:rtl w:val="0"/>
-          <w:lang w:val="en-US" w:bidi="en-US"/>
-        </w:rPr>
-        <w:t>BloomStore</w:t>
-      </w:r>
-      <w:r>
-        <w:rPr>
-          <w:rFonts w:ascii="Arial" w:hAnsi="Arial" w:cs="Arial" w:eastAsia="Arial"/>
-          <w:b w:val="0"/>
-          <w:color w:val="1F2933"/>
-          <w:sz w:val="24"/>
-          <w:szCs w:val="24"/>
-          <w:rtl w:val="1"/>
-          <w:lang w:val="en-US" w:bidi="he-IL"/>
-        </w:rPr>
-        <w:t xml:space="preserve"> כפי שהיא בנויה בפרויקט הזה.</w:t>
+        <w:drawing>
+          <wp:inline xmlns:a="http://schemas.openxmlformats.org/drawingml/2006/main" xmlns:pic="http://schemas.openxmlformats.org/drawingml/2006/picture">
+            <wp:extent cx="5400000" cy="7635264"/>
+            <wp:docPr id="1" name="Picture 1"/>
+            <wp:cNvGraphicFramePr>
+              <a:graphicFrameLocks noChangeAspect="1"/>
+            </wp:cNvGraphicFramePr>
+            <a:graphic>
+              <a:graphicData uri="http://schemas.openxmlformats.org/drawingml/2006/picture">
+                <pic:pic>
+                  <pic:nvPicPr>
+                    <pic:cNvPr id="0" name="student-declaration-1.png"/>
+                    <pic:cNvPicPr/>
+                  </pic:nvPicPr>
+                  <pic:blipFill>
+                    <a:blip r:embed="rId11"/>
+                    <a:stretch>
+                      <a:fillRect/>
+                    </a:stretch>
+                  </pic:blipFill>
+                  <pic:spPr>
+                    <a:xfrm>
+                      <a:off x="0" y="0"/>
+                      <a:ext cx="5400000" cy="7635264"/>
+                    </a:xfrm>
+                    <a:prstGeom prst="rect"/>
+                  </pic:spPr>
+                </pic:pic>
+              </a:graphicData>
+            </a:graphic>
+          </wp:inline>
+        </w:drawing>
+      </w:r>
+    </w:p>
+    <w:p>
+      <w:pPr>
+        <w:spacing w:before="160" w:after="40" w:line="240" w:lineRule="auto"/>
+        <w:jc w:val="center"/>
+        <w:bidi w:val="0"/>
+      </w:pPr>
+      <w:r>
+        <w:drawing>
+          <wp:inline xmlns:a="http://schemas.openxmlformats.org/drawingml/2006/main" xmlns:pic="http://schemas.openxmlformats.org/drawingml/2006/picture">
+            <wp:extent cx="5400000" cy="7635264"/>
+            <wp:docPr id="2" name="Picture 2"/>
+            <wp:cNvGraphicFramePr>
+              <a:graphicFrameLocks noChangeAspect="1"/>
+            </wp:cNvGraphicFramePr>
+            <a:graphic>
+              <a:graphicData uri="http://schemas.openxmlformats.org/drawingml/2006/picture">
+                <pic:pic>
+                  <pic:nvPicPr>
+                    <pic:cNvPr id="0" name="student-declaration-2.png"/>
+                    <pic:cNvPicPr/>
+                  </pic:nvPicPr>
+                  <pic:blipFill>
+                    <a:blip r:embed="rId12"/>
+                    <a:stretch>
+                      <a:fillRect/>
+                    </a:stretch>
+                  </pic:blipFill>
+                  <pic:spPr>
+                    <a:xfrm>
+                      <a:off x="0" y="0"/>
+                      <a:ext cx="5400000" cy="7635264"/>
+                    </a:xfrm>
+                    <a:prstGeom prst="rect"/>
+                  </pic:spPr>
+                </pic:pic>
+              </a:graphicData>
+            </a:graphic>
+          </wp:inline>
+        </w:drawing>
       </w:r>
     </w:p>
     <w:p>
@@ -10652,7 +10691,7 @@
         <w:drawing>
           <wp:inline xmlns:a="http://schemas.openxmlformats.org/drawingml/2006/main" xmlns:pic="http://schemas.openxmlformats.org/drawingml/2006/picture">
             <wp:extent cx="5400000" cy="2378963"/>
-            <wp:docPr id="1" name="Picture 1"/>
+            <wp:docPr id="3" name="Picture 3"/>
             <wp:cNvGraphicFramePr>
               <a:graphicFrameLocks noChangeAspect="1"/>
             </wp:cNvGraphicFramePr>
@@ -10664,7 +10703,7 @@
                     <pic:cNvPicPr/>
                   </pic:nvPicPr>
                   <pic:blipFill>
-                    <a:blip r:embed="rId11"/>
+                    <a:blip r:embed="rId13"/>
                     <a:stretch>
                       <a:fillRect/>
                     </a:stretch>
@@ -10977,7 +11016,7 @@
         <w:drawing>
           <wp:inline xmlns:a="http://schemas.openxmlformats.org/drawingml/2006/main" xmlns:pic="http://schemas.openxmlformats.org/drawingml/2006/picture">
             <wp:extent cx="5400000" cy="1095540"/>
-            <wp:docPr id="2" name="Picture 2"/>
+            <wp:docPr id="4" name="Picture 4"/>
             <wp:cNvGraphicFramePr>
               <a:graphicFrameLocks noChangeAspect="1"/>
             </wp:cNvGraphicFramePr>
@@ -10989,7 +11028,7 @@
                     <pic:cNvPicPr/>
                   </pic:nvPicPr>
                   <pic:blipFill>
-                    <a:blip r:embed="rId12"/>
+                    <a:blip r:embed="rId14"/>
                     <a:stretch>
                       <a:fillRect/>
                     </a:stretch>
@@ -12858,7 +12897,7 @@
         <w:drawing>
           <wp:inline xmlns:a="http://schemas.openxmlformats.org/drawingml/2006/main" xmlns:pic="http://schemas.openxmlformats.org/drawingml/2006/picture">
             <wp:extent cx="5400000" cy="1654573"/>
-            <wp:docPr id="3" name="Picture 3"/>
+            <wp:docPr id="5" name="Picture 5"/>
             <wp:cNvGraphicFramePr>
               <a:graphicFrameLocks noChangeAspect="1"/>
             </wp:cNvGraphicFramePr>
@@ -12870,7 +12909,7 @@
                     <pic:cNvPicPr/>
                   </pic:nvPicPr>
                   <pic:blipFill>
-                    <a:blip r:embed="rId13"/>
+                    <a:blip r:embed="rId15"/>
                     <a:stretch>
                       <a:fillRect/>
                     </a:stretch>
@@ -13893,7 +13932,7 @@
         <w:drawing>
           <wp:inline xmlns:a="http://schemas.openxmlformats.org/drawingml/2006/main" xmlns:pic="http://schemas.openxmlformats.org/drawingml/2006/picture">
             <wp:extent cx="5400000" cy="1144207"/>
-            <wp:docPr id="4" name="Picture 4"/>
+            <wp:docPr id="6" name="Picture 6"/>
             <wp:cNvGraphicFramePr>
               <a:graphicFrameLocks noChangeAspect="1"/>
             </wp:cNvGraphicFramePr>
@@ -13905,7 +13944,7 @@
                     <pic:cNvPicPr/>
                   </pic:nvPicPr>
                   <pic:blipFill>
-                    <a:blip r:embed="rId14"/>
+                    <a:blip r:embed="rId16"/>
                     <a:stretch>
                       <a:fillRect/>
                     </a:stretch>
@@ -16985,7 +17024,7 @@
         <w:drawing>
           <wp:inline xmlns:a="http://schemas.openxmlformats.org/drawingml/2006/main" xmlns:pic="http://schemas.openxmlformats.org/drawingml/2006/picture">
             <wp:extent cx="5400000" cy="1638110"/>
-            <wp:docPr id="5" name="Picture 5"/>
+            <wp:docPr id="7" name="Picture 7"/>
             <wp:cNvGraphicFramePr>
               <a:graphicFrameLocks noChangeAspect="1"/>
             </wp:cNvGraphicFramePr>
@@ -16997,7 +17036,7 @@
                     <pic:cNvPicPr/>
                   </pic:nvPicPr>
                   <pic:blipFill>
-                    <a:blip r:embed="rId15"/>
+                    <a:blip r:embed="rId17"/>
                     <a:stretch>
                       <a:fillRect/>
                     </a:stretch>
@@ -17626,7 +17665,7 @@
         <w:drawing>
           <wp:inline xmlns:a="http://schemas.openxmlformats.org/drawingml/2006/main" xmlns:pic="http://schemas.openxmlformats.org/drawingml/2006/picture">
             <wp:extent cx="5400000" cy="2749390"/>
-            <wp:docPr id="6" name="Picture 6"/>
+            <wp:docPr id="8" name="Picture 8"/>
             <wp:cNvGraphicFramePr>
               <a:graphicFrameLocks noChangeAspect="1"/>
             </wp:cNvGraphicFramePr>
@@ -17638,7 +17677,7 @@
                     <pic:cNvPicPr/>
                   </pic:nvPicPr>
                   <pic:blipFill>
-                    <a:blip r:embed="rId16"/>
+                    <a:blip r:embed="rId18"/>
                     <a:stretch>
                       <a:fillRect/>
                     </a:stretch>
@@ -17857,7 +17896,7 @@
         <w:drawing>
           <wp:inline xmlns:a="http://schemas.openxmlformats.org/drawingml/2006/main" xmlns:pic="http://schemas.openxmlformats.org/drawingml/2006/picture">
             <wp:extent cx="5400000" cy="2217490"/>
-            <wp:docPr id="7" name="Picture 7"/>
+            <wp:docPr id="9" name="Picture 9"/>
             <wp:cNvGraphicFramePr>
               <a:graphicFrameLocks noChangeAspect="1"/>
             </wp:cNvGraphicFramePr>
@@ -17869,7 +17908,7 @@
                     <pic:cNvPicPr/>
                   </pic:nvPicPr>
                   <pic:blipFill>
-                    <a:blip r:embed="rId17"/>
+                    <a:blip r:embed="rId19"/>
                     <a:stretch>
                       <a:fillRect/>
                     </a:stretch>
@@ -18241,7 +18280,7 @@
         <w:drawing>
           <wp:inline xmlns:a="http://schemas.openxmlformats.org/drawingml/2006/main" xmlns:pic="http://schemas.openxmlformats.org/drawingml/2006/picture">
             <wp:extent cx="5400000" cy="1885061"/>
-            <wp:docPr id="8" name="Picture 8"/>
+            <wp:docPr id="10" name="Picture 10"/>
             <wp:cNvGraphicFramePr>
               <a:graphicFrameLocks noChangeAspect="1"/>
             </wp:cNvGraphicFramePr>
@@ -18253,7 +18292,7 @@
                     <pic:cNvPicPr/>
                   </pic:nvPicPr>
                   <pic:blipFill>
-                    <a:blip r:embed="rId18"/>
+                    <a:blip r:embed="rId20"/>
                     <a:stretch>
                       <a:fillRect/>
                     </a:stretch>
@@ -27943,7 +27982,7 @@
           <w:rtl w:val="1"/>
           <w:lang w:val="en-US" w:bidi="he-IL"/>
         </w:rPr>
-        <w:t xml:space="preserve">תודה למור ברגיג על הליווי לאורך הפרויקט. למכללת אורט סינגאלובסקי תודה על הכלים ועל הידע שנרכשו במהלך הלימודים, ולקהילת הקוד הפתוח על הספריות ועל התיעוד שעליהם עומדת </w:t>
+        <w:t xml:space="preserve">תודה לאסף עמיר על הליווי לאורך הפרויקט. למכללת אורט סינגאלובסקי תודה על הכלים ועל הידע שנרכשו במהלך הלימודים, ולקהילת הקוד הפתוח על הספריות ועל התיעוד שעליהם עומדת </w:t>
       </w:r>
       <w:r>
         <w:rPr>

</xml_diff>

<commit_message>
Let admins upload a product image and edit existing products.
</commit_message>
<xml_diff>
--- a/docs/project-book.docx
+++ b/docs/project-book.docx
@@ -8222,7 +8222,7 @@
                 <w:rtl w:val="1"/>
                 <w:lang w:val="en-US" w:bidi="he-IL"/>
               </w:rPr>
-              <w:t>הוספה, סימון אזל, החזרה למלאי, מחיקה רכה</w:t>
+              <w:t>הוספה עם קובץ תמונה, עריכת פרטים ותמונה, סימון אזל, החזרה למלאי, מחיקה רכה</w:t>
             </w:r>
           </w:p>
         </w:tc>
@@ -16289,6 +16289,369 @@
           <w:rtl w:val="1"/>
           <w:lang w:val="en-US" w:bidi="he-IL"/>
         </w:rPr>
+        <w:t>תמונת מוצר.</w:t>
+      </w:r>
+      <w:r>
+        <w:rPr>
+          <w:rFonts w:ascii="Arial" w:hAnsi="Arial" w:cs="Arial" w:eastAsia="Arial"/>
+          <w:b w:val="0"/>
+          <w:color w:val="1F2933"/>
+          <w:sz w:val="24"/>
+          <w:szCs w:val="24"/>
+          <w:rtl w:val="1"/>
+          <w:lang w:val="en-US" w:bidi="he-IL"/>
+        </w:rPr>
+        <w:t xml:space="preserve"> </w:t>
+      </w:r>
+      <w:r>
+        <w:rPr>
+          <w:rFonts w:ascii="Courier New" w:hAnsi="Courier New" w:cs="Courier New" w:eastAsia="Courier New"/>
+          <w:b w:val="0"/>
+          <w:color w:val="1F2933"/>
+          <w:sz w:val="22"/>
+          <w:szCs w:val="22"/>
+          <w:rtl w:val="0"/>
+          <w:lang w:val="en-US" w:bidi="en-US"/>
+          <w:shd w:val="clear" w:color="auto" w:fill="F0E6DA"/>
+        </w:rPr>
+        <w:t>POST /api/products</w:t>
+      </w:r>
+      <w:r>
+        <w:rPr>
+          <w:rFonts w:ascii="Arial" w:hAnsi="Arial" w:cs="Arial" w:eastAsia="Arial"/>
+          <w:b w:val="0"/>
+          <w:color w:val="1F2933"/>
+          <w:sz w:val="24"/>
+          <w:szCs w:val="24"/>
+          <w:rtl w:val="1"/>
+          <w:lang w:val="en-US" w:bidi="he-IL"/>
+        </w:rPr>
+        <w:t xml:space="preserve"> מקבל </w:t>
+      </w:r>
+      <w:r>
+        <w:rPr>
+          <w:rFonts w:ascii="Courier New" w:hAnsi="Courier New" w:cs="Courier New" w:eastAsia="Courier New"/>
+          <w:b w:val="0"/>
+          <w:color w:val="1F2933"/>
+          <w:sz w:val="22"/>
+          <w:szCs w:val="22"/>
+          <w:rtl w:val="0"/>
+          <w:lang w:val="en-US" w:bidi="en-US"/>
+          <w:shd w:val="clear" w:color="auto" w:fill="F0E6DA"/>
+        </w:rPr>
+        <w:t>multipart/form-data</w:t>
+      </w:r>
+      <w:r>
+        <w:rPr>
+          <w:rFonts w:ascii="Arial" w:hAnsi="Arial" w:cs="Arial" w:eastAsia="Arial"/>
+          <w:b w:val="0"/>
+          <w:color w:val="1F2933"/>
+          <w:sz w:val="24"/>
+          <w:szCs w:val="24"/>
+          <w:rtl w:val="1"/>
+          <w:lang w:val="en-US" w:bidi="he-IL"/>
+        </w:rPr>
+        <w:t xml:space="preserve">. הקובץ </w:t>
+      </w:r>
+      <w:r>
+        <w:rPr>
+          <w:rFonts w:ascii="Times New Roman" w:hAnsi="Times New Roman" w:cs="Times New Roman" w:eastAsia="Times New Roman"/>
+          <w:b w:val="0"/>
+          <w:color w:val="1F2933"/>
+          <w:sz w:val="24"/>
+          <w:szCs w:val="24"/>
+          <w:rtl w:val="0"/>
+          <w:lang w:val="en-US" w:bidi="en-US"/>
+        </w:rPr>
+        <w:t>(JPEG</w:t>
+      </w:r>
+      <w:r>
+        <w:rPr>
+          <w:rFonts w:ascii="Arial" w:hAnsi="Arial" w:cs="Arial" w:eastAsia="Arial"/>
+          <w:b w:val="0"/>
+          <w:color w:val="1F2933"/>
+          <w:sz w:val="24"/>
+          <w:szCs w:val="24"/>
+          <w:rtl w:val="1"/>
+          <w:lang w:val="en-US" w:bidi="he-IL"/>
+        </w:rPr>
+        <w:t xml:space="preserve">, </w:t>
+      </w:r>
+      <w:r>
+        <w:rPr>
+          <w:rFonts w:ascii="Times New Roman" w:hAnsi="Times New Roman" w:cs="Times New Roman" w:eastAsia="Times New Roman"/>
+          <w:b w:val="0"/>
+          <w:color w:val="1F2933"/>
+          <w:sz w:val="24"/>
+          <w:szCs w:val="24"/>
+          <w:rtl w:val="0"/>
+          <w:lang w:val="en-US" w:bidi="en-US"/>
+        </w:rPr>
+        <w:t>PNG</w:t>
+      </w:r>
+      <w:r>
+        <w:rPr>
+          <w:rFonts w:ascii="Arial" w:hAnsi="Arial" w:cs="Arial" w:eastAsia="Arial"/>
+          <w:b w:val="0"/>
+          <w:color w:val="1F2933"/>
+          <w:sz w:val="24"/>
+          <w:szCs w:val="24"/>
+          <w:rtl w:val="1"/>
+          <w:lang w:val="en-US" w:bidi="he-IL"/>
+        </w:rPr>
+        <w:t xml:space="preserve">, </w:t>
+      </w:r>
+      <w:r>
+        <w:rPr>
+          <w:rFonts w:ascii="Times New Roman" w:hAnsi="Times New Roman" w:cs="Times New Roman" w:eastAsia="Times New Roman"/>
+          <w:b w:val="0"/>
+          <w:color w:val="1F2933"/>
+          <w:sz w:val="24"/>
+          <w:szCs w:val="24"/>
+          <w:rtl w:val="0"/>
+          <w:lang w:val="en-US" w:bidi="en-US"/>
+        </w:rPr>
+        <w:t>WebP</w:t>
+      </w:r>
+      <w:r>
+        <w:rPr>
+          <w:rFonts w:ascii="Arial" w:hAnsi="Arial" w:cs="Arial" w:eastAsia="Arial"/>
+          <w:b w:val="0"/>
+          <w:color w:val="1F2933"/>
+          <w:sz w:val="24"/>
+          <w:szCs w:val="24"/>
+          <w:rtl w:val="1"/>
+          <w:lang w:val="en-US" w:bidi="he-IL"/>
+        </w:rPr>
+        <w:t xml:space="preserve"> או </w:t>
+      </w:r>
+      <w:r>
+        <w:rPr>
+          <w:rFonts w:ascii="Times New Roman" w:hAnsi="Times New Roman" w:cs="Times New Roman" w:eastAsia="Times New Roman"/>
+          <w:b w:val="0"/>
+          <w:color w:val="1F2933"/>
+          <w:sz w:val="24"/>
+          <w:szCs w:val="24"/>
+          <w:rtl w:val="0"/>
+          <w:lang w:val="en-US" w:bidi="en-US"/>
+        </w:rPr>
+        <w:t>GIF</w:t>
+      </w:r>
+      <w:r>
+        <w:rPr>
+          <w:rFonts w:ascii="Arial" w:hAnsi="Arial" w:cs="Arial" w:eastAsia="Arial"/>
+          <w:b w:val="0"/>
+          <w:color w:val="1F2933"/>
+          <w:sz w:val="24"/>
+          <w:szCs w:val="24"/>
+          <w:rtl w:val="1"/>
+          <w:lang w:val="en-US" w:bidi="he-IL"/>
+        </w:rPr>
+        <w:t>, עד 5</w:t>
+      </w:r>
+      <w:r>
+        <w:rPr>
+          <w:rFonts w:ascii="Times New Roman" w:hAnsi="Times New Roman" w:cs="Times New Roman" w:eastAsia="Times New Roman"/>
+          <w:b w:val="0"/>
+          <w:color w:val="1F2933"/>
+          <w:sz w:val="24"/>
+          <w:szCs w:val="24"/>
+          <w:rtl w:val="0"/>
+          <w:lang w:val="en-US" w:bidi="en-US"/>
+        </w:rPr>
+        <w:t>MB)</w:t>
+      </w:r>
+      <w:r>
+        <w:rPr>
+          <w:rFonts w:ascii="Arial" w:hAnsi="Arial" w:cs="Arial" w:eastAsia="Arial"/>
+          <w:b w:val="0"/>
+          <w:color w:val="1F2933"/>
+          <w:sz w:val="24"/>
+          <w:szCs w:val="24"/>
+          <w:rtl w:val="1"/>
+          <w:lang w:val="en-US" w:bidi="he-IL"/>
+        </w:rPr>
+        <w:t xml:space="preserve"> נשמר ב־</w:t>
+      </w:r>
+      <w:r>
+        <w:rPr>
+          <w:rFonts w:ascii="Courier New" w:hAnsi="Courier New" w:cs="Courier New" w:eastAsia="Courier New"/>
+          <w:b w:val="0"/>
+          <w:color w:val="1F2933"/>
+          <w:sz w:val="22"/>
+          <w:szCs w:val="22"/>
+          <w:rtl w:val="0"/>
+          <w:lang w:val="en-US" w:bidi="en-US"/>
+          <w:shd w:val="clear" w:color="auto" w:fill="F0E6DA"/>
+        </w:rPr>
+        <w:t>uploads/products</w:t>
+      </w:r>
+      <w:r>
+        <w:rPr>
+          <w:rFonts w:ascii="Arial" w:hAnsi="Arial" w:cs="Arial" w:eastAsia="Arial"/>
+          <w:b w:val="0"/>
+          <w:color w:val="1F2933"/>
+          <w:sz w:val="24"/>
+          <w:szCs w:val="24"/>
+          <w:rtl w:val="1"/>
+          <w:lang w:val="en-US" w:bidi="he-IL"/>
+        </w:rPr>
+        <w:t>, ו־</w:t>
+      </w:r>
+      <w:r>
+        <w:rPr>
+          <w:rFonts w:ascii="Courier New" w:hAnsi="Courier New" w:cs="Courier New" w:eastAsia="Courier New"/>
+          <w:b w:val="0"/>
+          <w:color w:val="1F2933"/>
+          <w:sz w:val="22"/>
+          <w:szCs w:val="22"/>
+          <w:rtl w:val="0"/>
+          <w:lang w:val="en-US" w:bidi="en-US"/>
+          <w:shd w:val="clear" w:color="auto" w:fill="F0E6DA"/>
+        </w:rPr>
+        <w:t>imageUrl</w:t>
+      </w:r>
+      <w:r>
+        <w:rPr>
+          <w:rFonts w:ascii="Arial" w:hAnsi="Arial" w:cs="Arial" w:eastAsia="Arial"/>
+          <w:b w:val="0"/>
+          <w:color w:val="1F2933"/>
+          <w:sz w:val="24"/>
+          <w:szCs w:val="24"/>
+          <w:rtl w:val="1"/>
+          <w:lang w:val="en-US" w:bidi="he-IL"/>
+        </w:rPr>
+        <w:t xml:space="preserve"> מקבל את הכתובת הציבורית. הקבצים מוגשים מ־</w:t>
+      </w:r>
+      <w:r>
+        <w:rPr>
+          <w:rFonts w:ascii="Courier New" w:hAnsi="Courier New" w:cs="Courier New" w:eastAsia="Courier New"/>
+          <w:b w:val="0"/>
+          <w:color w:val="1F2933"/>
+          <w:sz w:val="22"/>
+          <w:szCs w:val="22"/>
+          <w:rtl w:val="0"/>
+          <w:lang w:val="en-US" w:bidi="en-US"/>
+          <w:shd w:val="clear" w:color="auto" w:fill="F0E6DA"/>
+        </w:rPr>
+        <w:t>/uploads/products/</w:t>
+      </w:r>
+      <w:r>
+        <w:rPr>
+          <w:rFonts w:ascii="Arial" w:hAnsi="Arial" w:cs="Arial" w:eastAsia="Arial"/>
+          <w:b w:val="0"/>
+          <w:color w:val="1F2933"/>
+          <w:sz w:val="24"/>
+          <w:szCs w:val="24"/>
+          <w:rtl w:val="1"/>
+          <w:lang w:val="en-US" w:bidi="he-IL"/>
+        </w:rPr>
+        <w:t xml:space="preserve">, מחוץ לקידומת </w:t>
+      </w:r>
+      <w:r>
+        <w:rPr>
+          <w:rFonts w:ascii="Courier New" w:hAnsi="Courier New" w:cs="Courier New" w:eastAsia="Courier New"/>
+          <w:b w:val="0"/>
+          <w:color w:val="1F2933"/>
+          <w:sz w:val="22"/>
+          <w:szCs w:val="22"/>
+          <w:rtl w:val="0"/>
+          <w:lang w:val="en-US" w:bidi="en-US"/>
+          <w:shd w:val="clear" w:color="auto" w:fill="F0E6DA"/>
+        </w:rPr>
+        <w:t>/api</w:t>
+      </w:r>
+      <w:r>
+        <w:rPr>
+          <w:rFonts w:ascii="Arial" w:hAnsi="Arial" w:cs="Arial" w:eastAsia="Arial"/>
+          <w:b w:val="0"/>
+          <w:color w:val="1F2933"/>
+          <w:sz w:val="24"/>
+          <w:szCs w:val="24"/>
+          <w:rtl w:val="1"/>
+          <w:lang w:val="en-US" w:bidi="he-IL"/>
+        </w:rPr>
+        <w:t xml:space="preserve">. </w:t>
+      </w:r>
+      <w:r>
+        <w:rPr>
+          <w:rFonts w:ascii="Courier New" w:hAnsi="Courier New" w:cs="Courier New" w:eastAsia="Courier New"/>
+          <w:b w:val="0"/>
+          <w:color w:val="1F2933"/>
+          <w:sz w:val="22"/>
+          <w:szCs w:val="22"/>
+          <w:rtl w:val="0"/>
+          <w:lang w:val="en-US" w:bidi="en-US"/>
+          <w:shd w:val="clear" w:color="auto" w:fill="F0E6DA"/>
+        </w:rPr>
+        <w:t>PATCH /api/products/:id</w:t>
+      </w:r>
+      <w:r>
+        <w:rPr>
+          <w:rFonts w:ascii="Arial" w:hAnsi="Arial" w:cs="Arial" w:eastAsia="Arial"/>
+          <w:b w:val="0"/>
+          <w:color w:val="1F2933"/>
+          <w:sz w:val="24"/>
+          <w:szCs w:val="24"/>
+          <w:rtl w:val="1"/>
+          <w:lang w:val="en-US" w:bidi="he-IL"/>
+        </w:rPr>
+        <w:t xml:space="preserve"> יכול להחליף את הקובץ. הקובץ הקודם נמחק רק אם אין הזמנה ששומרת אותו ב־</w:t>
+      </w:r>
+      <w:r>
+        <w:rPr>
+          <w:rFonts w:ascii="Times New Roman" w:hAnsi="Times New Roman" w:cs="Times New Roman" w:eastAsia="Times New Roman"/>
+          <w:b w:val="0"/>
+          <w:color w:val="1F2933"/>
+          <w:sz w:val="24"/>
+          <w:szCs w:val="24"/>
+          <w:rtl w:val="0"/>
+          <w:lang w:val="en-US" w:bidi="en-US"/>
+        </w:rPr>
+        <w:t>snapshot</w:t>
+      </w:r>
+      <w:r>
+        <w:rPr>
+          <w:rFonts w:ascii="Arial" w:hAnsi="Arial" w:cs="Arial" w:eastAsia="Arial"/>
+          <w:b w:val="0"/>
+          <w:color w:val="1F2933"/>
+          <w:sz w:val="24"/>
+          <w:szCs w:val="24"/>
+          <w:rtl w:val="1"/>
+          <w:lang w:val="en-US" w:bidi="he-IL"/>
+        </w:rPr>
+        <w:t>.</w:t>
+      </w:r>
+    </w:p>
+    <w:p>
+      <w:pPr>
+        <w:spacing w:line="360" w:lineRule="auto" w:after="80" w:before="0"/>
+        <w:jc w:val="right"/>
+        <w:bidi w:val="1"/>
+        <w:ind w:start="420" w:hanging="420"/>
+      </w:pPr>
+      <w:r>
+        <w:rPr>
+          <w:rFonts w:ascii="Arial" w:hAnsi="Arial" w:cs="Arial" w:eastAsia="Arial"/>
+          <w:b w:val="0"/>
+          <w:color w:val="1F2933"/>
+          <w:sz w:val="24"/>
+          <w:szCs w:val="24"/>
+          <w:rtl w:val="1"/>
+          <w:lang w:val="en-US" w:bidi="he-IL"/>
+        </w:rPr>
+        <w:t xml:space="preserve">• </w:t>
+      </w:r>
+      <w:r>
+        <w:rPr>
+          <w:rFonts w:ascii="Arial" w:hAnsi="Arial" w:cs="Arial" w:eastAsia="Arial"/>
+          <w:b/>
+          <w:color w:val="1F2933"/>
+          <w:sz w:val="24"/>
+          <w:szCs w:val="24"/>
+          <w:rtl w:val="1"/>
+          <w:lang w:val="en-US" w:bidi="he-IL"/>
+        </w:rPr>
         <w:t>החזרה למלאי.</w:t>
       </w:r>
       <w:r>
@@ -16663,7 +17026,7 @@
           <w:rtl w:val="1"/>
           <w:lang w:val="en-US" w:bidi="he-IL"/>
         </w:rPr>
-        <w:t xml:space="preserve">. כל טאב קורא לנקודת הקצה המתאימה. טופס הוספת המוצר רץ מול אותה סכמת </w:t>
+        <w:t xml:space="preserve">. כל טאב קורא לנקודת הקצה המתאימה. אותו טופס מוסיף מוצר או עורך מוצר קיים: שדות הטקסט, כולל המחיר, נבדקים מול סכמת </w:t>
       </w:r>
       <w:r>
         <w:rPr>
@@ -16687,7 +17050,7 @@
           <w:rtl w:val="1"/>
           <w:lang w:val="en-US" w:bidi="he-IL"/>
         </w:rPr>
-        <w:t xml:space="preserve"> שבשרת, כדי להציג שגיאות שדה לפני השליחה. תרשים העמודות של </w:t>
+        <w:t xml:space="preserve">, ותמונה חדשה נשלחת כקובץ. בעריכה אפשר להשאיר את התמונה הקיימת. תרשים העמודות של </w:t>
       </w:r>
       <w:r>
         <w:rPr>
@@ -19473,7 +19836,7 @@
                 <w:rtl w:val="1"/>
                 <w:lang w:val="en-US" w:bidi="he-IL"/>
               </w:rPr>
-              <w:t>יצירת מוצר</w:t>
+              <w:t>יצירת מוצר עם קובץ תמונה</w:t>
             </w:r>
           </w:p>
         </w:tc>
@@ -19569,7 +19932,7 @@
                 <w:rtl w:val="1"/>
                 <w:lang w:val="en-US" w:bidi="he-IL"/>
               </w:rPr>
-              <w:t>עדכון מוצר</w:t>
+              <w:t>עדכון מוצר, כולל מחיר ותמונה</w:t>
             </w:r>
           </w:p>
         </w:tc>

</xml_diff>

<commit_message>
Show store traffic, charts, and recent orders on the admin statistics page.
</commit_message>
<xml_diff>
--- a/docs/project-book.docx
+++ b/docs/project-book.docx
@@ -6290,7 +6290,7 @@
                 <w:rtl w:val="1"/>
                 <w:lang w:val="en-US" w:bidi="he-IL"/>
               </w:rPr>
-              <w:t>יומן ביקורת</w:t>
+              <w:t>יומן ביקורת וצפיות בדפים</w:t>
             </w:r>
           </w:p>
         </w:tc>
@@ -8412,7 +8412,7 @@
                 <w:rtl w:val="1"/>
                 <w:lang w:val="en-US" w:bidi="he-IL"/>
               </w:rPr>
-              <w:t>הכנסות, הזמנות פתוחות, מלאי נמוך, צמיחת משתמשים ותרשים שבועי</w:t>
+              <w:t>הכנסות, תנועת גולשים, הזמנות לפי סטטוס, מוצרים מובילים והזמנות אחרונות</w:t>
             </w:r>
           </w:p>
         </w:tc>
@@ -10371,6 +10371,81 @@
           <w:rtl w:val="1"/>
           <w:lang w:val="en-US" w:bidi="he-IL"/>
         </w:rPr>
+        <w:t xml:space="preserve">. בכל מעבר בין מסכים </w:t>
+      </w:r>
+      <w:r>
+        <w:rPr>
+          <w:rFonts w:ascii="Courier New" w:hAnsi="Courier New" w:cs="Courier New" w:eastAsia="Courier New"/>
+          <w:b w:val="0"/>
+          <w:color w:val="1F2933"/>
+          <w:sz w:val="22"/>
+          <w:szCs w:val="22"/>
+          <w:rtl w:val="0"/>
+          <w:lang w:val="en-US" w:bidi="en-US"/>
+          <w:shd w:val="clear" w:color="auto" w:fill="F0E6DA"/>
+        </w:rPr>
+        <w:t>TrackPageView</w:t>
+      </w:r>
+      <w:r>
+        <w:rPr>
+          <w:rFonts w:ascii="Arial" w:hAnsi="Arial" w:cs="Arial" w:eastAsia="Arial"/>
+          <w:b w:val="0"/>
+          <w:color w:val="1F2933"/>
+          <w:sz w:val="24"/>
+          <w:szCs w:val="24"/>
+          <w:rtl w:val="1"/>
+          <w:lang w:val="en-US" w:bidi="he-IL"/>
+        </w:rPr>
+        <w:t xml:space="preserve"> שולח </w:t>
+      </w:r>
+      <w:r>
+        <w:rPr>
+          <w:rFonts w:ascii="Courier New" w:hAnsi="Courier New" w:cs="Courier New" w:eastAsia="Courier New"/>
+          <w:b w:val="0"/>
+          <w:color w:val="1F2933"/>
+          <w:sz w:val="22"/>
+          <w:szCs w:val="22"/>
+          <w:rtl w:val="0"/>
+          <w:lang w:val="en-US" w:bidi="en-US"/>
+          <w:shd w:val="clear" w:color="auto" w:fill="F0E6DA"/>
+        </w:rPr>
+        <w:t>POST /api/traffic</w:t>
+      </w:r>
+      <w:r>
+        <w:rPr>
+          <w:rFonts w:ascii="Arial" w:hAnsi="Arial" w:cs="Arial" w:eastAsia="Arial"/>
+          <w:b w:val="0"/>
+          <w:color w:val="1F2933"/>
+          <w:sz w:val="24"/>
+          <w:szCs w:val="24"/>
+          <w:rtl w:val="1"/>
+          <w:lang w:val="en-US" w:bidi="he-IL"/>
+        </w:rPr>
+        <w:t xml:space="preserve"> עם הנתיב ומזהה מבקר שנשמר ב־</w:t>
+      </w:r>
+      <w:r>
+        <w:rPr>
+          <w:rFonts w:ascii="Courier New" w:hAnsi="Courier New" w:cs="Courier New" w:eastAsia="Courier New"/>
+          <w:b w:val="0"/>
+          <w:color w:val="1F2933"/>
+          <w:sz w:val="22"/>
+          <w:szCs w:val="22"/>
+          <w:rtl w:val="0"/>
+          <w:lang w:val="en-US" w:bidi="en-US"/>
+          <w:shd w:val="clear" w:color="auto" w:fill="F0E6DA"/>
+        </w:rPr>
+        <w:t>localStorage</w:t>
+      </w:r>
+      <w:r>
+        <w:rPr>
+          <w:rFonts w:ascii="Arial" w:hAnsi="Arial" w:cs="Arial" w:eastAsia="Arial"/>
+          <w:b w:val="0"/>
+          <w:color w:val="1F2933"/>
+          <w:sz w:val="24"/>
+          <w:szCs w:val="24"/>
+          <w:rtl w:val="1"/>
+          <w:lang w:val="en-US" w:bidi="he-IL"/>
+        </w:rPr>
         <w:t>.</w:t>
       </w:r>
     </w:p>
@@ -14395,6 +14470,31 @@
               </w:rPr>
               <w:t>GET /api/admin/stats</w:t>
             </w:r>
+            <w:r>
+              <w:rPr>
+                <w:rFonts w:ascii="Arial" w:hAnsi="Arial" w:cs="Arial" w:eastAsia="Arial"/>
+                <w:b w:val="0"/>
+                <w:color w:val="1F2933"/>
+                <w:sz w:val="22"/>
+                <w:szCs w:val="22"/>
+                <w:rtl w:val="1"/>
+                <w:lang w:val="en-US" w:bidi="he-IL"/>
+              </w:rPr>
+              <w:t xml:space="preserve">, </w:t>
+            </w:r>
+            <w:r>
+              <w:rPr>
+                <w:rFonts w:ascii="Courier New" w:hAnsi="Courier New" w:cs="Courier New" w:eastAsia="Courier New"/>
+                <w:b w:val="0"/>
+                <w:color w:val="1F2933"/>
+                <w:sz w:val="22"/>
+                <w:szCs w:val="22"/>
+                <w:rtl w:val="0"/>
+                <w:lang w:val="en-US" w:bidi="en-US"/>
+                <w:shd w:val="clear" w:color="auto" w:fill="F0E6DA"/>
+              </w:rPr>
+              <w:t>POST /api/traffic</w:t>
+            </w:r>
           </w:p>
         </w:tc>
       </w:tr>
@@ -14717,7 +14817,7 @@
                 <w:rtl w:val="1"/>
                 <w:lang w:val="en-US" w:bidi="he-IL"/>
               </w:rPr>
-              <w:t>שש שאילתות במקביל</w:t>
+              <w:t>סיכום מכירות, תנועה והזמנות אחרונות</w:t>
             </w:r>
           </w:p>
         </w:tc>
@@ -16795,7 +16895,126 @@
           <w:rtl w:val="1"/>
           <w:lang w:val="en-US" w:bidi="he-IL"/>
         </w:rPr>
-        <w:t xml:space="preserve"> יצירת מוצר, עדכון, מחיקה רכה ושינוי סטטוס נרשמים עם מזהה המנהל והמשאב.</w:t>
+        <w:t xml:space="preserve"> יצירת מוצר, עדכון, מחיקה רכה ושינוי סטטוס נרשמים עם מזהה המנהל והמשאב. צפייה בדף נרשמת כ־</w:t>
+      </w:r>
+      <w:r>
+        <w:rPr>
+          <w:rFonts w:ascii="Courier New" w:hAnsi="Courier New" w:cs="Courier New" w:eastAsia="Courier New"/>
+          <w:b w:val="0"/>
+          <w:color w:val="1F2933"/>
+          <w:sz w:val="22"/>
+          <w:szCs w:val="22"/>
+          <w:rtl w:val="0"/>
+          <w:lang w:val="en-US" w:bidi="en-US"/>
+          <w:shd w:val="clear" w:color="auto" w:fill="F0E6DA"/>
+        </w:rPr>
+        <w:t>page.view</w:t>
+      </w:r>
+      <w:r>
+        <w:rPr>
+          <w:rFonts w:ascii="Arial" w:hAnsi="Arial" w:cs="Arial" w:eastAsia="Arial"/>
+          <w:b w:val="0"/>
+          <w:color w:val="1F2933"/>
+          <w:sz w:val="24"/>
+          <w:szCs w:val="24"/>
+          <w:rtl w:val="1"/>
+          <w:lang w:val="en-US" w:bidi="he-IL"/>
+        </w:rPr>
+        <w:t xml:space="preserve"> באותה קולקציה, עם הנתיב ומזהה המבקר ב־</w:t>
+      </w:r>
+      <w:r>
+        <w:rPr>
+          <w:rFonts w:ascii="Courier New" w:hAnsi="Courier New" w:cs="Courier New" w:eastAsia="Courier New"/>
+          <w:b w:val="0"/>
+          <w:color w:val="1F2933"/>
+          <w:sz w:val="22"/>
+          <w:szCs w:val="22"/>
+          <w:rtl w:val="0"/>
+          <w:lang w:val="en-US" w:bidi="en-US"/>
+          <w:shd w:val="clear" w:color="auto" w:fill="F0E6DA"/>
+        </w:rPr>
+        <w:t>metadata</w:t>
+      </w:r>
+      <w:r>
+        <w:rPr>
+          <w:rFonts w:ascii="Arial" w:hAnsi="Arial" w:cs="Arial" w:eastAsia="Arial"/>
+          <w:b w:val="0"/>
+          <w:color w:val="1F2933"/>
+          <w:sz w:val="24"/>
+          <w:szCs w:val="24"/>
+          <w:rtl w:val="1"/>
+          <w:lang w:val="en-US" w:bidi="he-IL"/>
+        </w:rPr>
+        <w:t>.</w:t>
+      </w:r>
+    </w:p>
+    <w:p>
+      <w:pPr>
+        <w:spacing w:line="360" w:lineRule="auto" w:after="80" w:before="0"/>
+        <w:jc w:val="right"/>
+        <w:bidi w:val="1"/>
+        <w:ind w:start="420" w:hanging="420"/>
+      </w:pPr>
+      <w:r>
+        <w:rPr>
+          <w:rFonts w:ascii="Arial" w:hAnsi="Arial" w:cs="Arial" w:eastAsia="Arial"/>
+          <w:b w:val="0"/>
+          <w:color w:val="1F2933"/>
+          <w:sz w:val="24"/>
+          <w:szCs w:val="24"/>
+          <w:rtl w:val="1"/>
+          <w:lang w:val="en-US" w:bidi="he-IL"/>
+        </w:rPr>
+        <w:t xml:space="preserve">• </w:t>
+      </w:r>
+      <w:r>
+        <w:rPr>
+          <w:rFonts w:ascii="Arial" w:hAnsi="Arial" w:cs="Arial" w:eastAsia="Arial"/>
+          <w:b/>
+          <w:color w:val="1F2933"/>
+          <w:sz w:val="24"/>
+          <w:szCs w:val="24"/>
+          <w:rtl w:val="1"/>
+          <w:lang w:val="en-US" w:bidi="he-IL"/>
+        </w:rPr>
+        <w:t>תנועה בחנות.</w:t>
+      </w:r>
+      <w:r>
+        <w:rPr>
+          <w:rFonts w:ascii="Arial" w:hAnsi="Arial" w:cs="Arial" w:eastAsia="Arial"/>
+          <w:b w:val="0"/>
+          <w:color w:val="1F2933"/>
+          <w:sz w:val="24"/>
+          <w:szCs w:val="24"/>
+          <w:rtl w:val="1"/>
+          <w:lang w:val="en-US" w:bidi="he-IL"/>
+        </w:rPr>
+        <w:t xml:space="preserve"> </w:t>
+      </w:r>
+      <w:r>
+        <w:rPr>
+          <w:rFonts w:ascii="Courier New" w:hAnsi="Courier New" w:cs="Courier New" w:eastAsia="Courier New"/>
+          <w:b w:val="0"/>
+          <w:color w:val="1F2933"/>
+          <w:sz w:val="22"/>
+          <w:szCs w:val="22"/>
+          <w:rtl w:val="0"/>
+          <w:lang w:val="en-US" w:bidi="en-US"/>
+          <w:shd w:val="clear" w:color="auto" w:fill="F0E6DA"/>
+        </w:rPr>
+        <w:t>POST /api/traffic</w:t>
+      </w:r>
+      <w:r>
+        <w:rPr>
+          <w:rFonts w:ascii="Arial" w:hAnsi="Arial" w:cs="Arial" w:eastAsia="Arial"/>
+          <w:b w:val="0"/>
+          <w:color w:val="1F2933"/>
+          <w:sz w:val="24"/>
+          <w:szCs w:val="24"/>
+          <w:rtl w:val="1"/>
+          <w:lang w:val="en-US" w:bidi="he-IL"/>
+        </w:rPr>
+        <w:t xml:space="preserve"> פתוח לכל גולש ומוגבל בקצב. לוח הסטטיסטיקות קורא את הרשומות האלה ל־30 הימים האחרונים.</w:t>
       </w:r>
     </w:p>
     <w:p>
@@ -17050,7 +17269,7 @@
           <w:rtl w:val="1"/>
           <w:lang w:val="en-US" w:bidi="he-IL"/>
         </w:rPr>
-        <w:t xml:space="preserve">, ותמונה חדשה נשלחת כקובץ. בעריכה אפשר להשאיר את התמונה הקיימת. תרשים העמודות של </w:t>
+        <w:t xml:space="preserve">, ותמונה חדשה נשלחת כקובץ. בעריכה אפשר להשאיר את התמונה הקיימת. טאב </w:t>
       </w:r>
       <w:r>
         <w:rPr>
@@ -17062,44 +17281,43 @@
           <w:rtl w:val="0"/>
           <w:lang w:val="en-US" w:bidi="en-US"/>
         </w:rPr>
-        <w:t>Recharts</w:t>
-      </w:r>
-      <w:r>
-        <w:rPr>
-          <w:rFonts w:ascii="Arial" w:hAnsi="Arial" w:cs="Arial" w:eastAsia="Arial"/>
-          <w:b w:val="0"/>
-          <w:color w:val="1F2933"/>
-          <w:sz w:val="24"/>
-          <w:szCs w:val="24"/>
-          <w:rtl w:val="1"/>
-          <w:lang w:val="en-US" w:bidi="he-IL"/>
-        </w:rPr>
-        <w:t xml:space="preserve"> מצייר את </w:t>
-      </w:r>
-      <w:r>
-        <w:rPr>
-          <w:rFonts w:ascii="Courier New" w:hAnsi="Courier New" w:cs="Courier New" w:eastAsia="Courier New"/>
-          <w:b w:val="0"/>
-          <w:color w:val="1F2933"/>
-          <w:sz w:val="22"/>
-          <w:szCs w:val="22"/>
+        <w:t>Statistics</w:t>
+      </w:r>
+      <w:r>
+        <w:rPr>
+          <w:rFonts w:ascii="Arial" w:hAnsi="Arial" w:cs="Arial" w:eastAsia="Arial"/>
+          <w:b w:val="0"/>
+          <w:color w:val="1F2933"/>
+          <w:sz w:val="24"/>
+          <w:szCs w:val="24"/>
+          <w:rtl w:val="1"/>
+          <w:lang w:val="en-US" w:bidi="he-IL"/>
+        </w:rPr>
+        <w:t xml:space="preserve"> מצייר ב־</w:t>
+      </w:r>
+      <w:r>
+        <w:rPr>
+          <w:rFonts w:ascii="Times New Roman" w:hAnsi="Times New Roman" w:cs="Times New Roman" w:eastAsia="Times New Roman"/>
+          <w:b w:val="0"/>
+          <w:color w:val="1F2933"/>
+          <w:sz w:val="24"/>
+          <w:szCs w:val="24"/>
           <w:rtl w:val="0"/>
           <w:lang w:val="en-US" w:bidi="en-US"/>
-          <w:shd w:val="clear" w:color="auto" w:fill="F0E6DA"/>
-        </w:rPr>
-        <w:t>salesByDay</w:t>
-      </w:r>
-      <w:r>
-        <w:rPr>
-          <w:rFonts w:ascii="Arial" w:hAnsi="Arial" w:cs="Arial" w:eastAsia="Arial"/>
-          <w:b w:val="0"/>
-          <w:color w:val="1F2933"/>
-          <w:sz w:val="24"/>
-          <w:szCs w:val="24"/>
-          <w:rtl w:val="1"/>
-          <w:lang w:val="en-US" w:bidi="he-IL"/>
-        </w:rPr>
-        <w:t>.</w:t>
+        </w:rPr>
+        <w:t>Recharts</w:t>
+      </w:r>
+      <w:r>
+        <w:rPr>
+          <w:rFonts w:ascii="Arial" w:hAnsi="Arial" w:cs="Arial" w:eastAsia="Arial"/>
+          <w:b w:val="0"/>
+          <w:color w:val="1F2933"/>
+          <w:sz w:val="24"/>
+          <w:szCs w:val="24"/>
+          <w:rtl w:val="1"/>
+          <w:lang w:val="en-US" w:bidi="he-IL"/>
+        </w:rPr>
+        <w:t xml:space="preserve"> תנועת גולשים, מכירות, הזמנות לפי סטטוס, מוצרים מובילים, הכנסה לפי קטגוריה והעמודים הנצפים, ומתחתיהם את ההזמנות האחרונות.</w:t>
       </w:r>
     </w:p>
     <w:p>
@@ -21180,7 +21398,103 @@
                 <w:rtl w:val="1"/>
                 <w:lang w:val="en-US" w:bidi="he-IL"/>
               </w:rPr>
-              <w:t>לוח בקרה</w:t>
+              <w:t>לוח בקרה: מכירות, תנועה והזמנות אחרונות</w:t>
+            </w:r>
+          </w:p>
+        </w:tc>
+      </w:tr>
+      <w:tr>
+        <w:tc>
+          <w:tcPr>
+            <w:tcW w:type="dxa" w:w="2929"/>
+            <w:vAlign w:val="top"/>
+            <w:tcBorders>
+              <w:top w:val="single" w:sz="4" w:space="0" w:color="1F2933"/>
+              <w:left w:val="single" w:sz="4" w:space="0" w:color="1F2933"/>
+              <w:bottom w:val="single" w:sz="4" w:space="0" w:color="1F2933"/>
+              <w:right w:val="single" w:sz="4" w:space="0" w:color="1F2933"/>
+            </w:tcBorders>
+          </w:tcPr>
+          <w:p>
+            <w:pPr>
+              <w:spacing w:before="40" w:after="40" w:line="259" w:lineRule="auto"/>
+              <w:jc w:val="right"/>
+              <w:bidi w:val="1"/>
+            </w:pPr>
+            <w:r>
+              <w:rPr>
+                <w:rFonts w:ascii="Times New Roman" w:hAnsi="Times New Roman" w:cs="Times New Roman" w:eastAsia="Times New Roman"/>
+                <w:b w:val="0"/>
+                <w:color w:val="1F2933"/>
+                <w:sz w:val="22"/>
+                <w:szCs w:val="22"/>
+                <w:rtl w:val="0"/>
+                <w:lang w:val="en-US" w:bidi="en-US"/>
+              </w:rPr>
+              <w:t>POST</w:t>
+            </w:r>
+          </w:p>
+        </w:tc>
+        <w:tc>
+          <w:tcPr>
+            <w:tcW w:type="dxa" w:w="2929"/>
+            <w:vAlign w:val="top"/>
+            <w:tcBorders>
+              <w:top w:val="single" w:sz="4" w:space="0" w:color="1F2933"/>
+              <w:left w:val="single" w:sz="4" w:space="0" w:color="1F2933"/>
+              <w:bottom w:val="single" w:sz="4" w:space="0" w:color="1F2933"/>
+              <w:right w:val="single" w:sz="4" w:space="0" w:color="1F2933"/>
+            </w:tcBorders>
+          </w:tcPr>
+          <w:p>
+            <w:pPr>
+              <w:spacing w:before="40" w:after="40" w:line="259" w:lineRule="auto"/>
+              <w:jc w:val="right"/>
+              <w:bidi w:val="1"/>
+            </w:pPr>
+            <w:r>
+              <w:rPr>
+                <w:rFonts w:ascii="Courier New" w:hAnsi="Courier New" w:cs="Courier New" w:eastAsia="Courier New"/>
+                <w:b w:val="0"/>
+                <w:color w:val="1F2933"/>
+                <w:sz w:val="22"/>
+                <w:szCs w:val="22"/>
+                <w:rtl w:val="0"/>
+                <w:lang w:val="en-US" w:bidi="en-US"/>
+                <w:shd w:val="clear" w:color="auto" w:fill="F0E6DA"/>
+              </w:rPr>
+              <w:t>/api/traffic</w:t>
+            </w:r>
+          </w:p>
+        </w:tc>
+        <w:tc>
+          <w:tcPr>
+            <w:tcW w:type="dxa" w:w="2929"/>
+            <w:vAlign w:val="top"/>
+            <w:tcBorders>
+              <w:top w:val="single" w:sz="4" w:space="0" w:color="1F2933"/>
+              <w:left w:val="single" w:sz="4" w:space="0" w:color="1F2933"/>
+              <w:bottom w:val="single" w:sz="4" w:space="0" w:color="1F2933"/>
+              <w:right w:val="single" w:sz="4" w:space="0" w:color="1F2933"/>
+            </w:tcBorders>
+          </w:tcPr>
+          <w:p>
+            <w:pPr>
+              <w:spacing w:before="40" w:after="40" w:line="259" w:lineRule="auto"/>
+              <w:jc w:val="right"/>
+              <w:bidi w:val="1"/>
+            </w:pPr>
+            <w:r>
+              <w:rPr>
+                <w:rFonts w:ascii="Arial" w:hAnsi="Arial" w:cs="Arial" w:eastAsia="Arial"/>
+                <w:b w:val="0"/>
+                <w:color w:val="1F2933"/>
+                <w:sz w:val="22"/>
+                <w:szCs w:val="22"/>
+                <w:rtl w:val="1"/>
+                <w:lang w:val="en-US" w:bidi="he-IL"/>
+              </w:rPr>
+              <w:t>רישום צפייה בדף</w:t>
             </w:r>
           </w:p>
         </w:tc>

</xml_diff>

<commit_message>
Keep the admin statistics page working against the older stats API.
</commit_message>
<xml_diff>
--- a/docs/project-book.docx
+++ b/docs/project-book.docx
@@ -17317,7 +17317,82 @@
           <w:rtl w:val="1"/>
           <w:lang w:val="en-US" w:bidi="he-IL"/>
         </w:rPr>
-        <w:t xml:space="preserve"> תנועת גולשים, מכירות, הזמנות לפי סטטוס, מוצרים מובילים, הכנסה לפי קטגוריה והעמודים הנצפים, ומתחתיהם את ההזמנות האחרונות.</w:t>
+        <w:t xml:space="preserve"> תנועת גולשים, מכירות, הזמנות לפי סטטוס, מוצרים מובילים, הכנסה לפי קטגוריה והעמודים הנצפים, ומתחתיהם את ההזמנות האחרונות. אם תשובת </w:t>
+      </w:r>
+      <w:r>
+        <w:rPr>
+          <w:rFonts w:ascii="Courier New" w:hAnsi="Courier New" w:cs="Courier New" w:eastAsia="Courier New"/>
+          <w:b w:val="0"/>
+          <w:color w:val="1F2933"/>
+          <w:sz w:val="22"/>
+          <w:szCs w:val="22"/>
+          <w:rtl w:val="0"/>
+          <w:lang w:val="en-US" w:bidi="en-US"/>
+          <w:shd w:val="clear" w:color="auto" w:fill="F0E6DA"/>
+        </w:rPr>
+        <w:t>/api/admin/stats</w:t>
+      </w:r>
+      <w:r>
+        <w:rPr>
+          <w:rFonts w:ascii="Arial" w:hAnsi="Arial" w:cs="Arial" w:eastAsia="Arial"/>
+          <w:b w:val="0"/>
+          <w:color w:val="1F2933"/>
+          <w:sz w:val="24"/>
+          <w:szCs w:val="24"/>
+          <w:rtl w:val="1"/>
+          <w:lang w:val="en-US" w:bidi="he-IL"/>
+        </w:rPr>
+        <w:t xml:space="preserve"> עדיין בלי פירוט ההזמנות, המסך משלים את הגרפים מ־</w:t>
+      </w:r>
+      <w:r>
+        <w:rPr>
+          <w:rFonts w:ascii="Courier New" w:hAnsi="Courier New" w:cs="Courier New" w:eastAsia="Courier New"/>
+          <w:b w:val="0"/>
+          <w:color w:val="1F2933"/>
+          <w:sz w:val="22"/>
+          <w:szCs w:val="22"/>
+          <w:rtl w:val="0"/>
+          <w:lang w:val="en-US" w:bidi="en-US"/>
+          <w:shd w:val="clear" w:color="auto" w:fill="F0E6DA"/>
+        </w:rPr>
+        <w:t>GET /api/orders/admin</w:t>
+      </w:r>
+      <w:r>
+        <w:rPr>
+          <w:rFonts w:ascii="Arial" w:hAnsi="Arial" w:cs="Arial" w:eastAsia="Arial"/>
+          <w:b w:val="0"/>
+          <w:color w:val="1F2933"/>
+          <w:sz w:val="24"/>
+          <w:szCs w:val="24"/>
+          <w:rtl w:val="1"/>
+          <w:lang w:val="en-US" w:bidi="he-IL"/>
+        </w:rPr>
+        <w:t xml:space="preserve"> ומ־</w:t>
+      </w:r>
+      <w:r>
+        <w:rPr>
+          <w:rFonts w:ascii="Courier New" w:hAnsi="Courier New" w:cs="Courier New" w:eastAsia="Courier New"/>
+          <w:b w:val="0"/>
+          <w:color w:val="1F2933"/>
+          <w:sz w:val="22"/>
+          <w:szCs w:val="22"/>
+          <w:rtl w:val="0"/>
+          <w:lang w:val="en-US" w:bidi="en-US"/>
+          <w:shd w:val="clear" w:color="auto" w:fill="F0E6DA"/>
+        </w:rPr>
+        <w:t>GET /api/products/admin</w:t>
+      </w:r>
+      <w:r>
+        <w:rPr>
+          <w:rFonts w:ascii="Arial" w:hAnsi="Arial" w:cs="Arial" w:eastAsia="Arial"/>
+          <w:b w:val="0"/>
+          <w:color w:val="1F2933"/>
+          <w:sz w:val="24"/>
+          <w:szCs w:val="24"/>
+          <w:rtl w:val="1"/>
+          <w:lang w:val="en-US" w:bidi="he-IL"/>
+        </w:rPr>
+        <w:t>.</w:t>
       </w:r>
     </w:p>
     <w:p>

</xml_diff>